<commit_message>
Chnages for Partern Site from David Tyler (schedule)
</commit_message>
<xml_diff>
--- a/Non Web Site/Design/Facebook API.docx
+++ b/Non Web Site/Design/Facebook API.docx
@@ -9,6 +9,136 @@
     </w:p>
     <w:p/>
     <w:p>
+      <w:r>
+        <w:t>EAAaOYcSC5TIBStkYlG0LZCCvv03OCriZAtTNWa7LUjmWJxqApnXa3oGZCwjzWUfKZAxM76iLgaf2st9C4uZCNIrgchoNEoCkofreXFnp0AXH06lhbKG5BMJL4V4fKnQsf8dDfKqP3ZCQYIedBwns8hKaDixZAEL6jmQRQYPSKMclBjUbgUBn6iSHFBEQO2CCeOpkbIyXp1vFQAy4NPWYmy1QPnZBVgZBctWIqaLZCxQXQoMZAi9JKJDpEfyXqoALFwKrBBDR1CuN6eiyCjvKy561kDc</w:t>
+      </w:r>
+    </w:p>
+    <w:p>
+      <w:r>
+        <w:t>1845400420148530</w:t>
+      </w:r>
+    </w:p>
+    <w:p>
+      <w:r>
+        <w:t>https://graph.facebook.com/oauth/access_token?</w:t>
+      </w:r>
+    </w:p>
+    <w:p>
+      <w:r>
+        <w:t xml:space="preserve">  </w:t>
+      </w:r>
+      <w:proofErr w:type="spellStart"/>
+      <w:r>
+        <w:t>grant_type</w:t>
+      </w:r>
+      <w:proofErr w:type="spellEnd"/>
+      <w:r>
+        <w:t>=</w:t>
+      </w:r>
+      <w:proofErr w:type="spellStart"/>
+      <w:r>
+        <w:t>fb_exchange_token</w:t>
+      </w:r>
+      <w:proofErr w:type="spellEnd"/>
+      <w:r>
+        <w:t>&amp;</w:t>
+      </w:r>
+    </w:p>
+    <w:p>
+      <w:r>
+        <w:t xml:space="preserve">  </w:t>
+      </w:r>
+      <w:proofErr w:type="spellStart"/>
+      <w:r>
+        <w:t>client_id</w:t>
+      </w:r>
+      <w:proofErr w:type="spellEnd"/>
+      <w:r>
+        <w:t>=</w:t>
+      </w:r>
+      <w:r>
+        <w:t>1845400420148530</w:t>
+      </w:r>
+      <w:r>
+        <w:t>&amp;</w:t>
+      </w:r>
+    </w:p>
+    <w:p>
+      <w:r>
+        <w:t xml:space="preserve">  </w:t>
+      </w:r>
+      <w:proofErr w:type="spellStart"/>
+      <w:r>
+        <w:t>client_secret</w:t>
+      </w:r>
+      <w:proofErr w:type="spellEnd"/>
+      <w:r>
+        <w:t>=YOUR_APP_SECRET&amp;</w:t>
+      </w:r>
+    </w:p>
+    <w:p>
+      <w:r>
+        <w:t xml:space="preserve">  </w:t>
+      </w:r>
+      <w:proofErr w:type="spellStart"/>
+      <w:r>
+        <w:t>fb_exchange_token</w:t>
+      </w:r>
+      <w:proofErr w:type="spellEnd"/>
+      <w:r>
+        <w:t>=</w:t>
+      </w:r>
+      <w:r>
+        <w:t xml:space="preserve"> </w:t>
+      </w:r>
+      <w:r>
+        <w:t>EAAaOYcSC5TIBStkYlG0LZCCvv03OCriZAtTNWa7LUjmWJxqApnXa3oGZCwjzWUfKZAxM76iLgaf2st9C4uZCNIrgchoNEoCkofreXFnp0AXH06lhbKG5BMJL4V4fKnQsf8dDfKqP3ZCQYIedBwns8hKaDixZAEL6jmQRQYPSKMclBjUbgUBn6iSHFBEQO2CCeOpkbIyXp1vFQAy4NPWYmy1QPnZBVgZBctWIqaLZCxQXQoMZAi9JKJDpEfyXqoALFwKrBBDR1CuN6eiyCjvKy561kDc</w:t>
+      </w:r>
+    </w:p>
+    <w:p/>
+    <w:p>
+      <w:r>
+        <w:t xml:space="preserve">https://facebook.com?  </w:t>
+      </w:r>
+    </w:p>
+    <w:p>
+      <w:r>
+        <w:t xml:space="preserve">  </w:t>
+      </w:r>
+      <w:proofErr w:type="spellStart"/>
+      <w:r>
+        <w:t>grant_type</w:t>
+      </w:r>
+      <w:proofErr w:type="spellEnd"/>
+      <w:r>
+        <w:t>=</w:t>
+      </w:r>
+      <w:proofErr w:type="spellStart"/>
+      <w:r>
+        <w:t>fb_exchange_token</w:t>
+      </w:r>
+      <w:proofErr w:type="spellEnd"/>
+      <w:r>
+        <w:t xml:space="preserve">&amp;  </w:t>
+      </w:r>
+    </w:p>
+    <w:p>
+      <w:r>
+        <w:t xml:space="preserve">  </w:t>
+      </w:r>
+      <w:proofErr w:type="spellStart"/>
+      <w:r>
+        <w:t>client_id</w:t>
+      </w:r>
+      <w:proofErr w:type="spellEnd"/>
+      <w:r>
+        <w:t xml:space="preserve">=1845400420148530&amp;  </w:t>
+      </w:r>
+    </w:p>
+    <w:p>
+      <w:r>
+        <w:t xml:space="preserve">  fb_exchange_token=</w:t>
+      </w:r>
       <w:r>
         <w:t>EAAaOYcSC5TIBStkYlG0LZCCvv03OCriZAtTNWa7LUjmWJxqApnXa3oGZCwjzWUfKZAxM76iLgaf2st9C4uZCNIrgchoNEoCkofreXFnp0AXH06lhbKG5BMJL4V4fKnQsf8dDfKqP3ZCQYIedBwns8hKaDixZAEL6jmQRQYPSKMclBjUbgUBn6iSHFBEQO2CCeOpkbIyXp1vFQAy4NPWYmy1QPnZBVgZBctWIqaLZCxQXQoMZAi9JKJDpEfyXqoALFwKrBBDR1CuN6eiyCjvKy561kDc</w:t>
       </w:r>
@@ -626,7 +756,6 @@
   <w:style w:type="character" w:default="1" w:styleId="DefaultParagraphFont">
     <w:name w:val="Default Paragraph Font"/>
     <w:uiPriority w:val="1"/>
-    <w:semiHidden/>
     <w:unhideWhenUsed/>
   </w:style>
   <w:style w:type="table" w:default="1" w:styleId="TableNormal">

</xml_diff>

<commit_message>
Updated to use currator.io from elfsight for facebook - includes 2000 rather than 200 hits per mth
</commit_message>
<xml_diff>
--- a/Non Web Site/Design/Facebook API.docx
+++ b/Non Web Site/Design/Facebook API.docx
@@ -226,6 +226,88 @@
         <w:t>EAAaOYcSC5TIBStkYlG0LZCCvv03OCriZAtTNWa7LUjmWJxqApnXa3oGZCwjzWUfKZAxM76iLgaf2st9C4uZCNIrgchoNEoCkofreXFnp0AXH06lhbKG5BMJL4V4fKnQsf8dDfKqP3ZCQYIedBwns8hKaDixZAEL6jmQRQYPSKMclBjUbgUBn6iSHFBEQO2CCeOpkbIyXp1vFQAy4NPWYmy1QPnZBVgZBctWIqaLZCxQXQoMZAi9JKJDpEfyXqoALFwKrBBDR1CuN6eiyCjvKy561kDc</w:t>
       </w:r>
     </w:p>
+    <w:p/>
+    <w:p/>
+    <w:p>
+      <w:proofErr w:type="spellStart"/>
+      <w:r>
+        <w:t>facebook</w:t>
+      </w:r>
+      <w:proofErr w:type="spellEnd"/>
+      <w:r>
+        <w:t xml:space="preserve"> Page </w:t>
+      </w:r>
+      <w:r>
+        <w:t>–</w:t>
+      </w:r>
+      <w:r>
+        <w:t xml:space="preserve"> </w:t>
+      </w:r>
+      <w:r>
+        <w:t>1214322291773675</w:t>
+      </w:r>
+    </w:p>
+    <w:p/>
+    <w:p>
+      <w:pPr>
+        <w:rPr>
+          <w:b/>
+          <w:bCs/>
+        </w:rPr>
+      </w:pPr>
+      <w:r>
+        <w:rPr>
+          <w:b/>
+          <w:bCs/>
+        </w:rPr>
+        <w:t>Long lived token</w:t>
+      </w:r>
+    </w:p>
+    <w:p>
+      <w:r>
+        <w:t>EAAaOYcSC5TIBSu6XtxqZAMiflD953EAZCTKX30CXBFaNx54jtz0fSOzXpRvoJMVUGfN2dzKGSw0DkcSU7noeejOqn2tYZAQOZAbzJgmMqXSTjZCQM7X6X1n2guD3o5hYCMyAwE7WJv8ZCvoDXP54ZAR5rpyWJnqhFSFSFoZApOQZAkU9tSOzA0Vpe5XNVsZBX3pAZDZD</w:t>
+      </w:r>
+    </w:p>
+    <w:p>
+      <w:r>
+        <w:drawing>
+          <wp:inline distT="0" distB="0" distL="0" distR="0" wp14:anchorId="01FC1E0B" wp14:editId="60DE2E32">
+            <wp:extent cx="5731510" cy="2831465"/>
+            <wp:effectExtent l="0" t="0" r="2540" b="6985"/>
+            <wp:docPr id="630904374" name="Picture 1"/>
+            <wp:cNvGraphicFramePr>
+              <a:graphicFrameLocks xmlns:a="http://schemas.openxmlformats.org/drawingml/2006/main" noChangeAspect="1"/>
+            </wp:cNvGraphicFramePr>
+            <a:graphic xmlns:a="http://schemas.openxmlformats.org/drawingml/2006/main">
+              <a:graphicData uri="http://schemas.openxmlformats.org/drawingml/2006/picture">
+                <pic:pic xmlns:pic="http://schemas.openxmlformats.org/drawingml/2006/picture">
+                  <pic:nvPicPr>
+                    <pic:cNvPr id="630904374" name=""/>
+                    <pic:cNvPicPr/>
+                  </pic:nvPicPr>
+                  <pic:blipFill>
+                    <a:blip r:embed="rId4"/>
+                    <a:stretch>
+                      <a:fillRect/>
+                    </a:stretch>
+                  </pic:blipFill>
+                  <pic:spPr>
+                    <a:xfrm>
+                      <a:off x="0" y="0"/>
+                      <a:ext cx="5731510" cy="2831465"/>
+                    </a:xfrm>
+                    <a:prstGeom prst="rect">
+                      <a:avLst/>
+                    </a:prstGeom>
+                  </pic:spPr>
+                </pic:pic>
+              </a:graphicData>
+            </a:graphic>
+          </wp:inline>
+        </w:drawing>
+      </w:r>
+    </w:p>
+    <w:p/>
     <w:sectPr>
       <w:pgSz w:w="11906" w:h="16838"/>
       <w:pgMar w:top="1440" w:right="1440" w:bottom="1440" w:left="1440" w:header="708" w:footer="708" w:gutter="0"/>
@@ -839,7 +921,6 @@
   <w:style w:type="character" w:default="1" w:styleId="DefaultParagraphFont">
     <w:name w:val="Default Paragraph Font"/>
     <w:uiPriority w:val="1"/>
-    <w:semiHidden/>
     <w:unhideWhenUsed/>
   </w:style>
   <w:style w:type="table" w:default="1" w:styleId="TableNormal">

</xml_diff>